<commit_message>
Clean repository; outputs rendered with the corrected hurricane series
</commit_message>
<xml_diff>
--- a/Supplementary_Table_S10.docx
+++ b/Supplementary_Table_S10.docx
@@ -274,127 +274,127 @@
                 <w:rFonts w:ascii="Calibri" w:hAnsi="Calibri"/>
                 <w:sz w:val="20"/>
               </w:rPr>
-              <w:t xml:space="default">M4_av</w:t>
-            </w:r>
-          </w:p>
-        </w:tc>
-        <w:tc>
-          <w:tcPr>
-            <w:tcBorders>
-              <w:top w:val="single" w:space="0" w:color="D3D3D3"/>
-              <w:bottom w:val="single" w:space="0" w:color="D3D3D3"/>
-              <w:start w:val="single" w:space="0" w:color="D3D3D3"/>
-              <w:end w:val="single" w:space="0" w:color="D3D3D3"/>
-            </w:tcBorders>
-          </w:tcPr>
-          <w:p>
-            <w:pPr>
-              <w:spacing w:before="0" w:after="60"/>
-              <w:keepNext/>
-              <w:jc w:val="end"/>
-            </w:pPr>
-            <w:r>
-              <w:rPr>
-                <w:rFonts w:ascii="Calibri" w:hAnsi="Calibri"/>
-                <w:sz w:val="20"/>
-              </w:rPr>
-              <w:t xml:space="default">0.053</w:t>
-            </w:r>
-          </w:p>
-        </w:tc>
-        <w:tc>
-          <w:tcPr>
-            <w:tcBorders>
-              <w:top w:val="single" w:space="0" w:color="D3D3D3"/>
-              <w:bottom w:val="single" w:space="0" w:color="D3D3D3"/>
-              <w:start w:val="single" w:space="0" w:color="D3D3D3"/>
-              <w:end w:val="single" w:space="0" w:color="D3D3D3"/>
-            </w:tcBorders>
-          </w:tcPr>
-          <w:p>
-            <w:pPr>
-              <w:spacing w:before="0" w:after="60"/>
-              <w:keepNext/>
-              <w:jc w:val="end"/>
-            </w:pPr>
-            <w:r>
-              <w:rPr>
-                <w:rFonts w:ascii="Calibri" w:hAnsi="Calibri"/>
-                <w:sz w:val="20"/>
-              </w:rPr>
-              <w:t xml:space="default">1.850</w:t>
-            </w:r>
-          </w:p>
-        </w:tc>
-        <w:tc>
-          <w:tcPr>
-            <w:tcBorders>
-              <w:top w:val="single" w:space="0" w:color="D3D3D3"/>
-              <w:bottom w:val="single" w:space="0" w:color="D3D3D3"/>
-              <w:start w:val="single" w:space="0" w:color="D3D3D3"/>
-              <w:end w:val="single" w:space="0" w:color="D3D3D3"/>
-            </w:tcBorders>
-          </w:tcPr>
-          <w:p>
-            <w:pPr>
-              <w:spacing w:before="0" w:after="60"/>
-              <w:keepNext/>
-              <w:jc w:val="end"/>
-            </w:pPr>
-            <w:r>
-              <w:rPr>
-                <w:rFonts w:ascii="Calibri" w:hAnsi="Calibri"/>
-                <w:sz w:val="20"/>
-              </w:rPr>
-              <w:t xml:space="default">0.336</w:t>
-            </w:r>
-          </w:p>
-        </w:tc>
-        <w:tc>
-          <w:tcPr>
-            <w:tcBorders>
-              <w:top w:val="single" w:space="0" w:color="D3D3D3"/>
-              <w:bottom w:val="single" w:space="0" w:color="D3D3D3"/>
-              <w:start w:val="single" w:space="0" w:color="D3D3D3"/>
-              <w:end w:val="single" w:space="0" w:color="D3D3D3"/>
-            </w:tcBorders>
-          </w:tcPr>
-          <w:p>
-            <w:pPr>
-              <w:spacing w:before="0" w:after="60"/>
-              <w:keepNext/>
-              <w:jc w:val="end"/>
-            </w:pPr>
-            <w:r>
-              <w:rPr>
-                <w:rFonts w:ascii="Calibri" w:hAnsi="Calibri"/>
-                <w:sz w:val="20"/>
-              </w:rPr>
-              <w:t xml:space="default">16.436</w:t>
-            </w:r>
-          </w:p>
-        </w:tc>
-        <w:tc>
-          <w:tcPr>
-            <w:tcBorders>
-              <w:top w:val="single" w:space="0" w:color="D3D3D3"/>
-              <w:bottom w:val="single" w:space="0" w:color="D3D3D3"/>
-              <w:start w:val="single" w:space="0" w:color="D3D3D3"/>
-              <w:end w:val="single" w:space="0" w:color="D3D3D3"/>
-            </w:tcBorders>
-          </w:tcPr>
-          <w:p>
-            <w:pPr>
-              <w:spacing w:before="0" w:after="60"/>
-              <w:keepNext/>
-              <w:jc w:val="end"/>
-            </w:pPr>
-            <w:r>
-              <w:rPr>
-                <w:rFonts w:ascii="Calibri" w:hAnsi="Calibri"/>
-                <w:sz w:val="20"/>
-              </w:rPr>
-              <w:t xml:space="default">0.088</w:t>
+              <w:t xml:space="default">M6_av</w:t>
+            </w:r>
+          </w:p>
+        </w:tc>
+        <w:tc>
+          <w:tcPr>
+            <w:tcBorders>
+              <w:top w:val="single" w:space="0" w:color="D3D3D3"/>
+              <w:bottom w:val="single" w:space="0" w:color="D3D3D3"/>
+              <w:start w:val="single" w:space="0" w:color="D3D3D3"/>
+              <w:end w:val="single" w:space="0" w:color="D3D3D3"/>
+            </w:tcBorders>
+          </w:tcPr>
+          <w:p>
+            <w:pPr>
+              <w:spacing w:before="0" w:after="60"/>
+              <w:keepNext/>
+              <w:jc w:val="end"/>
+            </w:pPr>
+            <w:r>
+              <w:rPr>
+                <w:rFonts w:ascii="Calibri" w:hAnsi="Calibri"/>
+                <w:sz w:val="20"/>
+              </w:rPr>
+              <w:t xml:space="default">-0.101</w:t>
+            </w:r>
+          </w:p>
+        </w:tc>
+        <w:tc>
+          <w:tcPr>
+            <w:tcBorders>
+              <w:top w:val="single" w:space="0" w:color="D3D3D3"/>
+              <w:bottom w:val="single" w:space="0" w:color="D3D3D3"/>
+              <w:start w:val="single" w:space="0" w:color="D3D3D3"/>
+              <w:end w:val="single" w:space="0" w:color="D3D3D3"/>
+            </w:tcBorders>
+          </w:tcPr>
+          <w:p>
+            <w:pPr>
+              <w:spacing w:before="0" w:after="60"/>
+              <w:keepNext/>
+              <w:jc w:val="end"/>
+            </w:pPr>
+            <w:r>
+              <w:rPr>
+                <w:rFonts w:ascii="Calibri" w:hAnsi="Calibri"/>
+                <w:sz w:val="20"/>
+              </w:rPr>
+              <w:t xml:space="default">2.165</w:t>
+            </w:r>
+          </w:p>
+        </w:tc>
+        <w:tc>
+          <w:tcPr>
+            <w:tcBorders>
+              <w:top w:val="single" w:space="0" w:color="D3D3D3"/>
+              <w:bottom w:val="single" w:space="0" w:color="D3D3D3"/>
+              <w:start w:val="single" w:space="0" w:color="D3D3D3"/>
+              <w:end w:val="single" w:space="0" w:color="D3D3D3"/>
+            </w:tcBorders>
+          </w:tcPr>
+          <w:p>
+            <w:pPr>
+              <w:spacing w:before="0" w:after="60"/>
+              <w:keepNext/>
+              <w:jc w:val="end"/>
+            </w:pPr>
+            <w:r>
+              <w:rPr>
+                <w:rFonts w:ascii="Calibri" w:hAnsi="Calibri"/>
+                <w:sz w:val="20"/>
+              </w:rPr>
+              <w:t xml:space="default">0.679</w:t>
+            </w:r>
+          </w:p>
+        </w:tc>
+        <w:tc>
+          <w:tcPr>
+            <w:tcBorders>
+              <w:top w:val="single" w:space="0" w:color="D3D3D3"/>
+              <w:bottom w:val="single" w:space="0" w:color="D3D3D3"/>
+              <w:start w:val="single" w:space="0" w:color="D3D3D3"/>
+              <w:end w:val="single" w:space="0" w:color="D3D3D3"/>
+            </w:tcBorders>
+          </w:tcPr>
+          <w:p>
+            <w:pPr>
+              <w:spacing w:before="0" w:after="60"/>
+              <w:keepNext/>
+              <w:jc w:val="end"/>
+            </w:pPr>
+            <w:r>
+              <w:rPr>
+                <w:rFonts w:ascii="Calibri" w:hAnsi="Calibri"/>
+                <w:sz w:val="20"/>
+              </w:rPr>
+              <w:t xml:space="default">29.272</w:t>
+            </w:r>
+          </w:p>
+        </w:tc>
+        <w:tc>
+          <w:tcPr>
+            <w:tcBorders>
+              <w:top w:val="single" w:space="0" w:color="D3D3D3"/>
+              <w:bottom w:val="single" w:space="0" w:color="D3D3D3"/>
+              <w:start w:val="single" w:space="0" w:color="D3D3D3"/>
+              <w:end w:val="single" w:space="0" w:color="D3D3D3"/>
+            </w:tcBorders>
+          </w:tcPr>
+          <w:p>
+            <w:pPr>
+              <w:spacing w:before="0" w:after="60"/>
+              <w:keepNext/>
+              <w:jc w:val="end"/>
+            </w:pPr>
+            <w:r>
+              <w:rPr>
+                <w:rFonts w:ascii="Calibri" w:hAnsi="Calibri"/>
+                <w:sz w:val="20"/>
+              </w:rPr>
+              <w:t xml:space="default">0.001</w:t>
             </w:r>
           </w:p>
         </w:tc>
@@ -447,127 +447,127 @@
                 <w:rFonts w:ascii="Calibri" w:hAnsi="Calibri"/>
                 <w:sz w:val="20"/>
               </w:rPr>
-              <w:t xml:space="default">M4_fqcy</w:t>
-            </w:r>
-          </w:p>
-        </w:tc>
-        <w:tc>
-          <w:tcPr>
-            <w:tcBorders>
-              <w:top w:val="single" w:space="0" w:color="D3D3D3"/>
-              <w:bottom w:val="single" w:space="0" w:color="D3D3D3"/>
-              <w:start w:val="single" w:space="0" w:color="D3D3D3"/>
-              <w:end w:val="single" w:space="0" w:color="D3D3D3"/>
-            </w:tcBorders>
-          </w:tcPr>
-          <w:p>
-            <w:pPr>
-              <w:spacing w:before="0" w:after="60"/>
-              <w:keepNext/>
-              <w:jc w:val="end"/>
-            </w:pPr>
-            <w:r>
-              <w:rPr>
-                <w:rFonts w:ascii="Calibri" w:hAnsi="Calibri"/>
-                <w:sz w:val="20"/>
-              </w:rPr>
-              <w:t xml:space="default">0.352</w:t>
-            </w:r>
-          </w:p>
-        </w:tc>
-        <w:tc>
-          <w:tcPr>
-            <w:tcBorders>
-              <w:top w:val="single" w:space="0" w:color="D3D3D3"/>
-              <w:bottom w:val="single" w:space="0" w:color="D3D3D3"/>
-              <w:start w:val="single" w:space="0" w:color="D3D3D3"/>
-              <w:end w:val="single" w:space="0" w:color="D3D3D3"/>
-            </w:tcBorders>
-          </w:tcPr>
-          <w:p>
-            <w:pPr>
-              <w:spacing w:before="0" w:after="60"/>
-              <w:keepNext/>
-              <w:jc w:val="end"/>
-            </w:pPr>
-            <w:r>
-              <w:rPr>
-                <w:rFonts w:ascii="Calibri" w:hAnsi="Calibri"/>
-                <w:sz w:val="20"/>
-              </w:rPr>
-              <w:t xml:space="default">1.259</w:t>
-            </w:r>
-          </w:p>
-        </w:tc>
-        <w:tc>
-          <w:tcPr>
-            <w:tcBorders>
-              <w:top w:val="single" w:space="0" w:color="D3D3D3"/>
-              <w:bottom w:val="single" w:space="0" w:color="D3D3D3"/>
-              <w:start w:val="single" w:space="0" w:color="D3D3D3"/>
-              <w:end w:val="single" w:space="0" w:color="D3D3D3"/>
-            </w:tcBorders>
-          </w:tcPr>
-          <w:p>
-            <w:pPr>
-              <w:spacing w:before="0" w:after="60"/>
-              <w:keepNext/>
-              <w:jc w:val="end"/>
-            </w:pPr>
-            <w:r>
-              <w:rPr>
-                <w:rFonts w:ascii="Calibri" w:hAnsi="Calibri"/>
-                <w:sz w:val="20"/>
-              </w:rPr>
-              <w:t xml:space="default">0.005</w:t>
-            </w:r>
-          </w:p>
-        </w:tc>
-        <w:tc>
-          <w:tcPr>
-            <w:tcBorders>
-              <w:top w:val="single" w:space="0" w:color="D3D3D3"/>
-              <w:bottom w:val="single" w:space="0" w:color="D3D3D3"/>
-              <w:start w:val="single" w:space="0" w:color="D3D3D3"/>
-              <w:end w:val="single" w:space="0" w:color="D3D3D3"/>
-            </w:tcBorders>
-          </w:tcPr>
-          <w:p>
-            <w:pPr>
-              <w:spacing w:before="0" w:after="60"/>
-              <w:keepNext/>
-              <w:jc w:val="end"/>
-            </w:pPr>
-            <w:r>
-              <w:rPr>
-                <w:rFonts w:ascii="Calibri" w:hAnsi="Calibri"/>
-                <w:sz w:val="20"/>
-              </w:rPr>
-              <w:t xml:space="default">12.745</w:t>
-            </w:r>
-          </w:p>
-        </w:tc>
-        <w:tc>
-          <w:tcPr>
-            <w:tcBorders>
-              <w:top w:val="single" w:space="0" w:color="D3D3D3"/>
-              <w:bottom w:val="single" w:space="0" w:color="D3D3D3"/>
-              <w:start w:val="single" w:space="0" w:color="D3D3D3"/>
-              <w:end w:val="single" w:space="0" w:color="D3D3D3"/>
-            </w:tcBorders>
-          </w:tcPr>
-          <w:p>
-            <w:pPr>
-              <w:spacing w:before="0" w:after="60"/>
-              <w:keepNext/>
-              <w:jc w:val="end"/>
-            </w:pPr>
-            <w:r>
-              <w:rPr>
-                <w:rFonts w:ascii="Calibri" w:hAnsi="Calibri"/>
-                <w:sz w:val="20"/>
-              </w:rPr>
-              <w:t xml:space="default">0.238</w:t>
+              <w:t xml:space="default">M6_fqcy</w:t>
+            </w:r>
+          </w:p>
+        </w:tc>
+        <w:tc>
+          <w:tcPr>
+            <w:tcBorders>
+              <w:top w:val="single" w:space="0" w:color="D3D3D3"/>
+              <w:bottom w:val="single" w:space="0" w:color="D3D3D3"/>
+              <w:start w:val="single" w:space="0" w:color="D3D3D3"/>
+              <w:end w:val="single" w:space="0" w:color="D3D3D3"/>
+            </w:tcBorders>
+          </w:tcPr>
+          <w:p>
+            <w:pPr>
+              <w:spacing w:before="0" w:after="60"/>
+              <w:keepNext/>
+              <w:jc w:val="end"/>
+            </w:pPr>
+            <w:r>
+              <w:rPr>
+                <w:rFonts w:ascii="Calibri" w:hAnsi="Calibri"/>
+                <w:sz w:val="20"/>
+              </w:rPr>
+              <w:t xml:space="default">0.331</w:t>
+            </w:r>
+          </w:p>
+        </w:tc>
+        <w:tc>
+          <w:tcPr>
+            <w:tcBorders>
+              <w:top w:val="single" w:space="0" w:color="D3D3D3"/>
+              <w:bottom w:val="single" w:space="0" w:color="D3D3D3"/>
+              <w:start w:val="single" w:space="0" w:color="D3D3D3"/>
+              <w:end w:val="single" w:space="0" w:color="D3D3D3"/>
+            </w:tcBorders>
+          </w:tcPr>
+          <w:p>
+            <w:pPr>
+              <w:spacing w:before="0" w:after="60"/>
+              <w:keepNext/>
+              <w:jc w:val="end"/>
+            </w:pPr>
+            <w:r>
+              <w:rPr>
+                <w:rFonts w:ascii="Calibri" w:hAnsi="Calibri"/>
+                <w:sz w:val="20"/>
+              </w:rPr>
+              <w:t xml:space="default">1.270</w:t>
+            </w:r>
+          </w:p>
+        </w:tc>
+        <w:tc>
+          <w:tcPr>
+            <w:tcBorders>
+              <w:top w:val="single" w:space="0" w:color="D3D3D3"/>
+              <w:bottom w:val="single" w:space="0" w:color="D3D3D3"/>
+              <w:start w:val="single" w:space="0" w:color="D3D3D3"/>
+              <w:end w:val="single" w:space="0" w:color="D3D3D3"/>
+            </w:tcBorders>
+          </w:tcPr>
+          <w:p>
+            <w:pPr>
+              <w:spacing w:before="0" w:after="60"/>
+              <w:keepNext/>
+              <w:jc w:val="end"/>
+            </w:pPr>
+            <w:r>
+              <w:rPr>
+                <w:rFonts w:ascii="Calibri" w:hAnsi="Calibri"/>
+                <w:sz w:val="20"/>
+              </w:rPr>
+              <w:t xml:space="default">0.006</w:t>
+            </w:r>
+          </w:p>
+        </w:tc>
+        <w:tc>
+          <w:tcPr>
+            <w:tcBorders>
+              <w:top w:val="single" w:space="0" w:color="D3D3D3"/>
+              <w:bottom w:val="single" w:space="0" w:color="D3D3D3"/>
+              <w:start w:val="single" w:space="0" w:color="D3D3D3"/>
+              <w:end w:val="single" w:space="0" w:color="D3D3D3"/>
+            </w:tcBorders>
+          </w:tcPr>
+          <w:p>
+            <w:pPr>
+              <w:spacing w:before="0" w:after="60"/>
+              <w:keepNext/>
+              <w:jc w:val="end"/>
+            </w:pPr>
+            <w:r>
+              <w:rPr>
+                <w:rFonts w:ascii="Calibri" w:hAnsi="Calibri"/>
+                <w:sz w:val="20"/>
+              </w:rPr>
+              <w:t xml:space="default">13.842</w:t>
+            </w:r>
+          </w:p>
+        </w:tc>
+        <w:tc>
+          <w:tcPr>
+            <w:tcBorders>
+              <w:top w:val="single" w:space="0" w:color="D3D3D3"/>
+              <w:bottom w:val="single" w:space="0" w:color="D3D3D3"/>
+              <w:start w:val="single" w:space="0" w:color="D3D3D3"/>
+              <w:end w:val="single" w:space="0" w:color="D3D3D3"/>
+            </w:tcBorders>
+          </w:tcPr>
+          <w:p>
+            <w:pPr>
+              <w:spacing w:before="0" w:after="60"/>
+              <w:keepNext/>
+              <w:jc w:val="end"/>
+            </w:pPr>
+            <w:r>
+              <w:rPr>
+                <w:rFonts w:ascii="Calibri" w:hAnsi="Calibri"/>
+                <w:sz w:val="20"/>
+              </w:rPr>
+              <w:t xml:space="default">0.180</w:t>
             </w:r>
           </w:p>
         </w:tc>
@@ -620,127 +620,127 @@
                 <w:rFonts w:ascii="Calibri" w:hAnsi="Calibri"/>
                 <w:sz w:val="20"/>
               </w:rPr>
-              <w:t xml:space="default">M4_av</w:t>
-            </w:r>
-          </w:p>
-        </w:tc>
-        <w:tc>
-          <w:tcPr>
-            <w:tcBorders>
-              <w:top w:val="single" w:space="0" w:color="D3D3D3"/>
-              <w:bottom w:val="single" w:space="0" w:color="D3D3D3"/>
-              <w:start w:val="single" w:space="0" w:color="D3D3D3"/>
-              <w:end w:val="single" w:space="0" w:color="D3D3D3"/>
-            </w:tcBorders>
-          </w:tcPr>
-          <w:p>
-            <w:pPr>
-              <w:spacing w:before="0" w:after="60"/>
-              <w:keepNext/>
-              <w:jc w:val="end"/>
-            </w:pPr>
-            <w:r>
-              <w:rPr>
-                <w:rFonts w:ascii="Calibri" w:hAnsi="Calibri"/>
-                <w:sz w:val="20"/>
-              </w:rPr>
-              <w:t xml:space="default">-0.132</w:t>
-            </w:r>
-          </w:p>
-        </w:tc>
-        <w:tc>
-          <w:tcPr>
-            <w:tcBorders>
-              <w:top w:val="single" w:space="0" w:color="D3D3D3"/>
-              <w:bottom w:val="single" w:space="0" w:color="D3D3D3"/>
-              <w:start w:val="single" w:space="0" w:color="D3D3D3"/>
-              <w:end w:val="single" w:space="0" w:color="D3D3D3"/>
-            </w:tcBorders>
-          </w:tcPr>
-          <w:p>
-            <w:pPr>
-              <w:spacing w:before="0" w:after="60"/>
-              <w:keepNext/>
-              <w:jc w:val="end"/>
-            </w:pPr>
-            <w:r>
-              <w:rPr>
-                <w:rFonts w:ascii="Calibri" w:hAnsi="Calibri"/>
-                <w:sz w:val="20"/>
-              </w:rPr>
-              <w:t xml:space="default">2.144</w:t>
-            </w:r>
-          </w:p>
-        </w:tc>
-        <w:tc>
-          <w:tcPr>
-            <w:tcBorders>
-              <w:top w:val="single" w:space="0" w:color="D3D3D3"/>
-              <w:bottom w:val="single" w:space="0" w:color="D3D3D3"/>
-              <w:start w:val="single" w:space="0" w:color="D3D3D3"/>
-              <w:end w:val="single" w:space="0" w:color="D3D3D3"/>
-            </w:tcBorders>
-          </w:tcPr>
-          <w:p>
-            <w:pPr>
-              <w:spacing w:before="0" w:after="60"/>
-              <w:keepNext/>
-              <w:jc w:val="end"/>
-            </w:pPr>
-            <w:r>
-              <w:rPr>
-                <w:rFonts w:ascii="Calibri" w:hAnsi="Calibri"/>
-                <w:sz w:val="20"/>
-              </w:rPr>
-              <w:t xml:space="default">0.640</w:t>
-            </w:r>
-          </w:p>
-        </w:tc>
-        <w:tc>
-          <w:tcPr>
-            <w:tcBorders>
-              <w:top w:val="single" w:space="0" w:color="D3D3D3"/>
-              <w:bottom w:val="single" w:space="0" w:color="D3D3D3"/>
-              <w:start w:val="single" w:space="0" w:color="D3D3D3"/>
-              <w:end w:val="single" w:space="0" w:color="D3D3D3"/>
-            </w:tcBorders>
-          </w:tcPr>
-          <w:p>
-            <w:pPr>
-              <w:spacing w:before="0" w:after="60"/>
-              <w:keepNext/>
-              <w:jc w:val="end"/>
-            </w:pPr>
-            <w:r>
-              <w:rPr>
-                <w:rFonts w:ascii="Calibri" w:hAnsi="Calibri"/>
-                <w:sz w:val="20"/>
-              </w:rPr>
-              <w:t xml:space="default">12.483</w:t>
-            </w:r>
-          </w:p>
-        </w:tc>
-        <w:tc>
-          <w:tcPr>
-            <w:tcBorders>
-              <w:top w:val="single" w:space="0" w:color="D3D3D3"/>
-              <w:bottom w:val="single" w:space="0" w:color="D3D3D3"/>
-              <w:start w:val="single" w:space="0" w:color="D3D3D3"/>
-              <w:end w:val="single" w:space="0" w:color="D3D3D3"/>
-            </w:tcBorders>
-          </w:tcPr>
-          <w:p>
-            <w:pPr>
-              <w:spacing w:before="0" w:after="60"/>
-              <w:keepNext/>
-              <w:jc w:val="end"/>
-            </w:pPr>
-            <w:r>
-              <w:rPr>
-                <w:rFonts w:ascii="Calibri" w:hAnsi="Calibri"/>
-                <w:sz w:val="20"/>
-              </w:rPr>
-              <w:t xml:space="default">0.254</w:t>
+              <w:t xml:space="default">M7_fqcy</w:t>
+            </w:r>
+          </w:p>
+        </w:tc>
+        <w:tc>
+          <w:tcPr>
+            <w:tcBorders>
+              <w:top w:val="single" w:space="0" w:color="D3D3D3"/>
+              <w:bottom w:val="single" w:space="0" w:color="D3D3D3"/>
+              <w:start w:val="single" w:space="0" w:color="D3D3D3"/>
+              <w:end w:val="single" w:space="0" w:color="D3D3D3"/>
+            </w:tcBorders>
+          </w:tcPr>
+          <w:p>
+            <w:pPr>
+              <w:spacing w:before="0" w:after="60"/>
+              <w:keepNext/>
+              <w:jc w:val="end"/>
+            </w:pPr>
+            <w:r>
+              <w:rPr>
+                <w:rFonts w:ascii="Calibri" w:hAnsi="Calibri"/>
+                <w:sz w:val="20"/>
+              </w:rPr>
+              <w:t xml:space="default">-0.154</w:t>
+            </w:r>
+          </w:p>
+        </w:tc>
+        <w:tc>
+          <w:tcPr>
+            <w:tcBorders>
+              <w:top w:val="single" w:space="0" w:color="D3D3D3"/>
+              <w:bottom w:val="single" w:space="0" w:color="D3D3D3"/>
+              <w:start w:val="single" w:space="0" w:color="D3D3D3"/>
+              <w:end w:val="single" w:space="0" w:color="D3D3D3"/>
+            </w:tcBorders>
+          </w:tcPr>
+          <w:p>
+            <w:pPr>
+              <w:spacing w:before="0" w:after="60"/>
+              <w:keepNext/>
+              <w:jc w:val="end"/>
+            </w:pPr>
+            <w:r>
+              <w:rPr>
+                <w:rFonts w:ascii="Calibri" w:hAnsi="Calibri"/>
+                <w:sz w:val="20"/>
+              </w:rPr>
+              <w:t xml:space="default">2.050</w:t>
+            </w:r>
+          </w:p>
+        </w:tc>
+        <w:tc>
+          <w:tcPr>
+            <w:tcBorders>
+              <w:top w:val="single" w:space="0" w:color="D3D3D3"/>
+              <w:bottom w:val="single" w:space="0" w:color="D3D3D3"/>
+              <w:start w:val="single" w:space="0" w:color="D3D3D3"/>
+              <w:end w:val="single" w:space="0" w:color="D3D3D3"/>
+            </w:tcBorders>
+          </w:tcPr>
+          <w:p>
+            <w:pPr>
+              <w:spacing w:before="0" w:after="60"/>
+              <w:keepNext/>
+              <w:jc w:val="end"/>
+            </w:pPr>
+            <w:r>
+              <w:rPr>
+                <w:rFonts w:ascii="Calibri" w:hAnsi="Calibri"/>
+                <w:sz w:val="20"/>
+              </w:rPr>
+              <w:t xml:space="default">0.549</w:t>
+            </w:r>
+          </w:p>
+        </w:tc>
+        <w:tc>
+          <w:tcPr>
+            <w:tcBorders>
+              <w:top w:val="single" w:space="0" w:color="D3D3D3"/>
+              <w:bottom w:val="single" w:space="0" w:color="D3D3D3"/>
+              <w:start w:val="single" w:space="0" w:color="D3D3D3"/>
+              <w:end w:val="single" w:space="0" w:color="D3D3D3"/>
+            </w:tcBorders>
+          </w:tcPr>
+          <w:p>
+            <w:pPr>
+              <w:spacing w:before="0" w:after="60"/>
+              <w:keepNext/>
+              <w:jc w:val="end"/>
+            </w:pPr>
+            <w:r>
+              <w:rPr>
+                <w:rFonts w:ascii="Calibri" w:hAnsi="Calibri"/>
+                <w:sz w:val="20"/>
+              </w:rPr>
+              <w:t xml:space="default">16.148</w:t>
+            </w:r>
+          </w:p>
+        </w:tc>
+        <w:tc>
+          <w:tcPr>
+            <w:tcBorders>
+              <w:top w:val="single" w:space="0" w:color="D3D3D3"/>
+              <w:bottom w:val="single" w:space="0" w:color="D3D3D3"/>
+              <w:start w:val="single" w:space="0" w:color="D3D3D3"/>
+              <w:end w:val="single" w:space="0" w:color="D3D3D3"/>
+            </w:tcBorders>
+          </w:tcPr>
+          <w:p>
+            <w:pPr>
+              <w:spacing w:before="0" w:after="60"/>
+              <w:keepNext/>
+              <w:jc w:val="end"/>
+            </w:pPr>
+            <w:r>
+              <w:rPr>
+                <w:rFonts w:ascii="Calibri" w:hAnsi="Calibri"/>
+                <w:sz w:val="20"/>
+              </w:rPr>
+              <w:t xml:space="default">0.095</w:t>
             </w:r>
           </w:p>
         </w:tc>
@@ -793,127 +793,127 @@
                 <w:rFonts w:ascii="Calibri" w:hAnsi="Calibri"/>
                 <w:sz w:val="20"/>
               </w:rPr>
-              <w:t xml:space="default">M7_av</w:t>
-            </w:r>
-          </w:p>
-        </w:tc>
-        <w:tc>
-          <w:tcPr>
-            <w:tcBorders>
-              <w:top w:val="single" w:space="0" w:color="D3D3D3"/>
-              <w:bottom w:val="single" w:space="0" w:color="D3D3D3"/>
-              <w:start w:val="single" w:space="0" w:color="D3D3D3"/>
-              <w:end w:val="single" w:space="0" w:color="D3D3D3"/>
-            </w:tcBorders>
-          </w:tcPr>
-          <w:p>
-            <w:pPr>
-              <w:spacing w:before="0" w:after="60"/>
-              <w:keepNext/>
-              <w:jc w:val="end"/>
-            </w:pPr>
-            <w:r>
-              <w:rPr>
-                <w:rFonts w:ascii="Calibri" w:hAnsi="Calibri"/>
-                <w:sz w:val="20"/>
-              </w:rPr>
-              <w:t xml:space="default">-0.570</w:t>
-            </w:r>
-          </w:p>
-        </w:tc>
-        <w:tc>
-          <w:tcPr>
-            <w:tcBorders>
-              <w:top w:val="single" w:space="0" w:color="D3D3D3"/>
-              <w:bottom w:val="single" w:space="0" w:color="D3D3D3"/>
-              <w:start w:val="single" w:space="0" w:color="D3D3D3"/>
-              <w:end w:val="single" w:space="0" w:color="D3D3D3"/>
-            </w:tcBorders>
-          </w:tcPr>
-          <w:p>
-            <w:pPr>
-              <w:spacing w:before="0" w:after="60"/>
-              <w:keepNext/>
-              <w:jc w:val="end"/>
-            </w:pPr>
-            <w:r>
-              <w:rPr>
-                <w:rFonts w:ascii="Calibri" w:hAnsi="Calibri"/>
-                <w:sz w:val="20"/>
-              </w:rPr>
-              <w:t xml:space="default">3.108</w:t>
-            </w:r>
-          </w:p>
-        </w:tc>
-        <w:tc>
-          <w:tcPr>
-            <w:tcBorders>
-              <w:top w:val="single" w:space="0" w:color="D3D3D3"/>
-              <w:bottom w:val="single" w:space="0" w:color="D3D3D3"/>
-              <w:start w:val="single" w:space="0" w:color="D3D3D3"/>
-              <w:end w:val="single" w:space="0" w:color="D3D3D3"/>
-            </w:tcBorders>
-          </w:tcPr>
-          <w:p>
-            <w:pPr>
-              <w:spacing w:before="0" w:after="60"/>
-              <w:keepNext/>
-              <w:jc w:val="end"/>
-            </w:pPr>
-            <w:r>
-              <w:rPr>
-                <w:rFonts w:ascii="Calibri" w:hAnsi="Calibri"/>
-                <w:sz w:val="20"/>
-              </w:rPr>
-              <w:t xml:space="default">0.996</w:t>
-            </w:r>
-          </w:p>
-        </w:tc>
-        <w:tc>
-          <w:tcPr>
-            <w:tcBorders>
-              <w:top w:val="single" w:space="0" w:color="D3D3D3"/>
-              <w:bottom w:val="single" w:space="0" w:color="D3D3D3"/>
-              <w:start w:val="single" w:space="0" w:color="D3D3D3"/>
-              <w:end w:val="single" w:space="0" w:color="D3D3D3"/>
-            </w:tcBorders>
-          </w:tcPr>
-          <w:p>
-            <w:pPr>
-              <w:spacing w:before="0" w:after="60"/>
-              <w:keepNext/>
-              <w:jc w:val="end"/>
-            </w:pPr>
-            <w:r>
-              <w:rPr>
-                <w:rFonts w:ascii="Calibri" w:hAnsi="Calibri"/>
-                <w:sz w:val="20"/>
-              </w:rPr>
-              <w:t xml:space="default">14.707</w:t>
-            </w:r>
-          </w:p>
-        </w:tc>
-        <w:tc>
-          <w:tcPr>
-            <w:tcBorders>
-              <w:top w:val="single" w:space="0" w:color="D3D3D3"/>
-              <w:bottom w:val="single" w:space="0" w:color="D3D3D3"/>
-              <w:start w:val="single" w:space="0" w:color="D3D3D3"/>
-              <w:end w:val="single" w:space="0" w:color="D3D3D3"/>
-            </w:tcBorders>
-          </w:tcPr>
-          <w:p>
-            <w:pPr>
-              <w:spacing w:before="0" w:after="60"/>
-              <w:keepNext/>
-              <w:jc w:val="end"/>
-            </w:pPr>
-            <w:r>
-              <w:rPr>
-                <w:rFonts w:ascii="Calibri" w:hAnsi="Calibri"/>
-                <w:sz w:val="20"/>
-              </w:rPr>
-              <w:t xml:space="default">0.143</w:t>
+              <w:t xml:space="default">M4_av</w:t>
+            </w:r>
+          </w:p>
+        </w:tc>
+        <w:tc>
+          <w:tcPr>
+            <w:tcBorders>
+              <w:top w:val="single" w:space="0" w:color="D3D3D3"/>
+              <w:bottom w:val="single" w:space="0" w:color="D3D3D3"/>
+              <w:start w:val="single" w:space="0" w:color="D3D3D3"/>
+              <w:end w:val="single" w:space="0" w:color="D3D3D3"/>
+            </w:tcBorders>
+          </w:tcPr>
+          <w:p>
+            <w:pPr>
+              <w:spacing w:before="0" w:after="60"/>
+              <w:keepNext/>
+              <w:jc w:val="end"/>
+            </w:pPr>
+            <w:r>
+              <w:rPr>
+                <w:rFonts w:ascii="Calibri" w:hAnsi="Calibri"/>
+                <w:sz w:val="20"/>
+              </w:rPr>
+              <w:t xml:space="default">-0.504</w:t>
+            </w:r>
+          </w:p>
+        </w:tc>
+        <w:tc>
+          <w:tcPr>
+            <w:tcBorders>
+              <w:top w:val="single" w:space="0" w:color="D3D3D3"/>
+              <w:bottom w:val="single" w:space="0" w:color="D3D3D3"/>
+              <w:start w:val="single" w:space="0" w:color="D3D3D3"/>
+              <w:end w:val="single" w:space="0" w:color="D3D3D3"/>
+            </w:tcBorders>
+          </w:tcPr>
+          <w:p>
+            <w:pPr>
+              <w:spacing w:before="0" w:after="60"/>
+              <w:keepNext/>
+              <w:jc w:val="end"/>
+            </w:pPr>
+            <w:r>
+              <w:rPr>
+                <w:rFonts w:ascii="Calibri" w:hAnsi="Calibri"/>
+                <w:sz w:val="20"/>
+              </w:rPr>
+              <w:t xml:space="default">2.761</w:t>
+            </w:r>
+          </w:p>
+        </w:tc>
+        <w:tc>
+          <w:tcPr>
+            <w:tcBorders>
+              <w:top w:val="single" w:space="0" w:color="D3D3D3"/>
+              <w:bottom w:val="single" w:space="0" w:color="D3D3D3"/>
+              <w:start w:val="single" w:space="0" w:color="D3D3D3"/>
+              <w:end w:val="single" w:space="0" w:color="D3D3D3"/>
+            </w:tcBorders>
+          </w:tcPr>
+          <w:p>
+            <w:pPr>
+              <w:spacing w:before="0" w:after="60"/>
+              <w:keepNext/>
+              <w:jc w:val="end"/>
+            </w:pPr>
+            <w:r>
+              <w:rPr>
+                <w:rFonts w:ascii="Calibri" w:hAnsi="Calibri"/>
+                <w:sz w:val="20"/>
+              </w:rPr>
+              <w:t xml:space="default">0.960</w:t>
+            </w:r>
+          </w:p>
+        </w:tc>
+        <w:tc>
+          <w:tcPr>
+            <w:tcBorders>
+              <w:top w:val="single" w:space="0" w:color="D3D3D3"/>
+              <w:bottom w:val="single" w:space="0" w:color="D3D3D3"/>
+              <w:start w:val="single" w:space="0" w:color="D3D3D3"/>
+              <w:end w:val="single" w:space="0" w:color="D3D3D3"/>
+            </w:tcBorders>
+          </w:tcPr>
+          <w:p>
+            <w:pPr>
+              <w:spacing w:before="0" w:after="60"/>
+              <w:keepNext/>
+              <w:jc w:val="end"/>
+            </w:pPr>
+            <w:r>
+              <w:rPr>
+                <w:rFonts w:ascii="Calibri" w:hAnsi="Calibri"/>
+                <w:sz w:val="20"/>
+              </w:rPr>
+              <w:t xml:space="default">8.391</w:t>
+            </w:r>
+          </w:p>
+        </w:tc>
+        <w:tc>
+          <w:tcPr>
+            <w:tcBorders>
+              <w:top w:val="single" w:space="0" w:color="D3D3D3"/>
+              <w:bottom w:val="single" w:space="0" w:color="D3D3D3"/>
+              <w:start w:val="single" w:space="0" w:color="D3D3D3"/>
+              <w:end w:val="single" w:space="0" w:color="D3D3D3"/>
+            </w:tcBorders>
+          </w:tcPr>
+          <w:p>
+            <w:pPr>
+              <w:spacing w:before="0" w:after="60"/>
+              <w:keepNext/>
+              <w:jc w:val="end"/>
+            </w:pPr>
+            <w:r>
+              <w:rPr>
+                <w:rFonts w:ascii="Calibri" w:hAnsi="Calibri"/>
+                <w:sz w:val="20"/>
+              </w:rPr>
+              <w:t xml:space="default">0.591</w:t>
             </w:r>
           </w:p>
         </w:tc>
@@ -966,127 +966,127 @@
                 <w:rFonts w:ascii="Calibri" w:hAnsi="Calibri"/>
                 <w:sz w:val="20"/>
               </w:rPr>
-              <w:t xml:space="default">M4_av</w:t>
-            </w:r>
-          </w:p>
-        </w:tc>
-        <w:tc>
-          <w:tcPr>
-            <w:tcBorders>
-              <w:top w:val="single" w:space="0" w:color="D3D3D3"/>
-              <w:bottom w:val="single" w:space="0" w:color="D3D3D3"/>
-              <w:start w:val="single" w:space="0" w:color="D3D3D3"/>
-              <w:end w:val="single" w:space="0" w:color="D3D3D3"/>
-            </w:tcBorders>
-          </w:tcPr>
-          <w:p>
-            <w:pPr>
-              <w:spacing w:before="0" w:after="60"/>
-              <w:keepNext/>
-              <w:jc w:val="end"/>
-            </w:pPr>
-            <w:r>
-              <w:rPr>
-                <w:rFonts w:ascii="Calibri" w:hAnsi="Calibri"/>
-                <w:sz w:val="20"/>
-              </w:rPr>
-              <w:t xml:space="default">0.016</w:t>
-            </w:r>
-          </w:p>
-        </w:tc>
-        <w:tc>
-          <w:tcPr>
-            <w:tcBorders>
-              <w:top w:val="single" w:space="0" w:color="D3D3D3"/>
-              <w:bottom w:val="single" w:space="0" w:color="D3D3D3"/>
-              <w:start w:val="single" w:space="0" w:color="D3D3D3"/>
-              <w:end w:val="single" w:space="0" w:color="D3D3D3"/>
-            </w:tcBorders>
-          </w:tcPr>
-          <w:p>
-            <w:pPr>
-              <w:spacing w:before="0" w:after="60"/>
-              <w:keepNext/>
-              <w:jc w:val="end"/>
-            </w:pPr>
-            <w:r>
-              <w:rPr>
-                <w:rFonts w:ascii="Calibri" w:hAnsi="Calibri"/>
-                <w:sz w:val="20"/>
-              </w:rPr>
-              <w:t xml:space="default">1.953</w:t>
-            </w:r>
-          </w:p>
-        </w:tc>
-        <w:tc>
-          <w:tcPr>
-            <w:tcBorders>
-              <w:top w:val="single" w:space="0" w:color="D3D3D3"/>
-              <w:bottom w:val="single" w:space="0" w:color="D3D3D3"/>
-              <w:start w:val="single" w:space="0" w:color="D3D3D3"/>
-              <w:end w:val="single" w:space="0" w:color="D3D3D3"/>
-            </w:tcBorders>
-          </w:tcPr>
-          <w:p>
-            <w:pPr>
-              <w:spacing w:before="0" w:after="60"/>
-              <w:keepNext/>
-              <w:jc w:val="end"/>
-            </w:pPr>
-            <w:r>
-              <w:rPr>
-                <w:rFonts w:ascii="Calibri" w:hAnsi="Calibri"/>
-                <w:sz w:val="20"/>
-              </w:rPr>
-              <w:t xml:space="default">0.429</w:t>
-            </w:r>
-          </w:p>
-        </w:tc>
-        <w:tc>
-          <w:tcPr>
-            <w:tcBorders>
-              <w:top w:val="single" w:space="0" w:color="D3D3D3"/>
-              <w:bottom w:val="single" w:space="0" w:color="D3D3D3"/>
-              <w:start w:val="single" w:space="0" w:color="D3D3D3"/>
-              <w:end w:val="single" w:space="0" w:color="D3D3D3"/>
-            </w:tcBorders>
-          </w:tcPr>
-          <w:p>
-            <w:pPr>
-              <w:spacing w:before="0" w:after="60"/>
-              <w:keepNext/>
-              <w:jc w:val="end"/>
-            </w:pPr>
-            <w:r>
-              <w:rPr>
-                <w:rFonts w:ascii="Calibri" w:hAnsi="Calibri"/>
-                <w:sz w:val="20"/>
-              </w:rPr>
-              <w:t xml:space="default">11.190</w:t>
-            </w:r>
-          </w:p>
-        </w:tc>
-        <w:tc>
-          <w:tcPr>
-            <w:tcBorders>
-              <w:top w:val="single" w:space="0" w:color="D3D3D3"/>
-              <w:bottom w:val="single" w:space="0" w:color="D3D3D3"/>
-              <w:start w:val="single" w:space="0" w:color="D3D3D3"/>
-              <w:end w:val="single" w:space="0" w:color="D3D3D3"/>
-            </w:tcBorders>
-          </w:tcPr>
-          <w:p>
-            <w:pPr>
-              <w:spacing w:before="0" w:after="60"/>
-              <w:keepNext/>
-              <w:jc w:val="end"/>
-            </w:pPr>
-            <w:r>
-              <w:rPr>
-                <w:rFonts w:ascii="Calibri" w:hAnsi="Calibri"/>
-                <w:sz w:val="20"/>
-              </w:rPr>
-              <w:t xml:space="default">0.343</w:t>
+              <w:t xml:space="default">M7_av</w:t>
+            </w:r>
+          </w:p>
+        </w:tc>
+        <w:tc>
+          <w:tcPr>
+            <w:tcBorders>
+              <w:top w:val="single" w:space="0" w:color="D3D3D3"/>
+              <w:bottom w:val="single" w:space="0" w:color="D3D3D3"/>
+              <w:start w:val="single" w:space="0" w:color="D3D3D3"/>
+              <w:end w:val="single" w:space="0" w:color="D3D3D3"/>
+            </w:tcBorders>
+          </w:tcPr>
+          <w:p>
+            <w:pPr>
+              <w:spacing w:before="0" w:after="60"/>
+              <w:keepNext/>
+              <w:jc w:val="end"/>
+            </w:pPr>
+            <w:r>
+              <w:rPr>
+                <w:rFonts w:ascii="Calibri" w:hAnsi="Calibri"/>
+                <w:sz w:val="20"/>
+              </w:rPr>
+              <w:t xml:space="default">0.008</w:t>
+            </w:r>
+          </w:p>
+        </w:tc>
+        <w:tc>
+          <w:tcPr>
+            <w:tcBorders>
+              <w:top w:val="single" w:space="0" w:color="D3D3D3"/>
+              <w:bottom w:val="single" w:space="0" w:color="D3D3D3"/>
+              <w:start w:val="single" w:space="0" w:color="D3D3D3"/>
+              <w:end w:val="single" w:space="0" w:color="D3D3D3"/>
+            </w:tcBorders>
+          </w:tcPr>
+          <w:p>
+            <w:pPr>
+              <w:spacing w:before="0" w:after="60"/>
+              <w:keepNext/>
+              <w:jc w:val="end"/>
+            </w:pPr>
+            <w:r>
+              <w:rPr>
+                <w:rFonts w:ascii="Calibri" w:hAnsi="Calibri"/>
+                <w:sz w:val="20"/>
+              </w:rPr>
+              <w:t xml:space="default">1.967</w:t>
+            </w:r>
+          </w:p>
+        </w:tc>
+        <w:tc>
+          <w:tcPr>
+            <w:tcBorders>
+              <w:top w:val="single" w:space="0" w:color="D3D3D3"/>
+              <w:bottom w:val="single" w:space="0" w:color="D3D3D3"/>
+              <w:start w:val="single" w:space="0" w:color="D3D3D3"/>
+              <w:end w:val="single" w:space="0" w:color="D3D3D3"/>
+            </w:tcBorders>
+          </w:tcPr>
+          <w:p>
+            <w:pPr>
+              <w:spacing w:before="0" w:after="60"/>
+              <w:keepNext/>
+              <w:jc w:val="end"/>
+            </w:pPr>
+            <w:r>
+              <w:rPr>
+                <w:rFonts w:ascii="Calibri" w:hAnsi="Calibri"/>
+                <w:sz w:val="20"/>
+              </w:rPr>
+              <w:t xml:space="default">0.450</w:t>
+            </w:r>
+          </w:p>
+        </w:tc>
+        <w:tc>
+          <w:tcPr>
+            <w:tcBorders>
+              <w:top w:val="single" w:space="0" w:color="D3D3D3"/>
+              <w:bottom w:val="single" w:space="0" w:color="D3D3D3"/>
+              <w:start w:val="single" w:space="0" w:color="D3D3D3"/>
+              <w:end w:val="single" w:space="0" w:color="D3D3D3"/>
+            </w:tcBorders>
+          </w:tcPr>
+          <w:p>
+            <w:pPr>
+              <w:spacing w:before="0" w:after="60"/>
+              <w:keepNext/>
+              <w:jc w:val="end"/>
+            </w:pPr>
+            <w:r>
+              <w:rPr>
+                <w:rFonts w:ascii="Calibri" w:hAnsi="Calibri"/>
+                <w:sz w:val="20"/>
+              </w:rPr>
+              <w:t xml:space="default">13.501</w:t>
+            </w:r>
+          </w:p>
+        </w:tc>
+        <w:tc>
+          <w:tcPr>
+            <w:tcBorders>
+              <w:top w:val="single" w:space="0" w:color="D3D3D3"/>
+              <w:bottom w:val="single" w:space="0" w:color="D3D3D3"/>
+              <w:start w:val="single" w:space="0" w:color="D3D3D3"/>
+              <w:end w:val="single" w:space="0" w:color="D3D3D3"/>
+            </w:tcBorders>
+          </w:tcPr>
+          <w:p>
+            <w:pPr>
+              <w:spacing w:before="0" w:after="60"/>
+              <w:keepNext/>
+              <w:jc w:val="end"/>
+            </w:pPr>
+            <w:r>
+              <w:rPr>
+                <w:rFonts w:ascii="Calibri" w:hAnsi="Calibri"/>
+                <w:sz w:val="20"/>
+              </w:rPr>
+              <w:t xml:space="default">0.197</w:t>
             </w:r>
           </w:p>
         </w:tc>

</xml_diff>